<commit_message>
Karta spisu: panel Cloudová AI (stupeň citlivosti, souhlas klienta, odvolání, stav cloudu v kanceláři)
</commit_message>
<xml_diff>
--- a/docs/kancelar/7_Souhlas_klienta_cloud.docx
+++ b/docs/kancelar/7_Souhlas_klienta_cloud.docx
@@ -572,13 +572,7 @@
         <w:spacing w:after="60"/>
       </w:pPr>
       <w:r>
-        <w:t xml:space="preserve">Souhlas zaznamená v LexisLocalu advokát (typ „pro tento spis“ nebo „rámcový“) s poznámkou, jak byl udělen. Záznam se zapíše do deníku spisu a do auditu. </w:t>
-      </w:r>
-      <w:r>
-        <w:rPr>
-          <w:highlight w:val="yellow"/>
-        </w:rPr>
-        <w:t>[doplnit: dokud není hotové tlačítko na kartě spisu, zaznamená souhlas správce podle návodu IMPLEMENTACE_KANCELAR.md]</w:t>
+        <w:t>Souhlas zaznamená v LexisLocalu advokát (typ „pro tento spis“ nebo „rámcový“) s poznámkou, jak byl udělen. Záznam se zapíše do deníku spisu a do auditu. V LexisLocalu: Spisová služba → spis → panel „Cloudová AI“.</w:t>
       </w:r>
     </w:p>
     <w:p>

</xml_diff>